<commit_message>
docs: regenerate the user manuals and the evidence matrix with the mobile screenshots
</commit_message>
<xml_diff>
--- a/09_MANUALES/EN/WORD/09_Customer_User_Manual.docx
+++ b/09_MANUALES/EN/WORD/09_Customer_User_Manual.docx
@@ -2,7 +2,7 @@
 <file path=word/document.xml><?xml version="1.0" encoding="utf-8"?>
 <w:document xmlns:w="http://schemas.openxmlformats.org/wordprocessingml/2006/main" xmlns:m="http://schemas.openxmlformats.org/officeDocument/2006/math" xmlns:r="http://schemas.openxmlformats.org/officeDocument/2006/relationships" xmlns:o="urn:schemas-microsoft-com:office:office" xmlns:v="urn:schemas-microsoft-com:vml" xmlns:w10="urn:schemas-microsoft-com:office:word" xmlns:a="http://schemas.openxmlformats.org/drawingml/2006/main" xmlns:pic="http://schemas.openxmlformats.org/drawingml/2006/picture" xmlns:wp="http://schemas.openxmlformats.org/drawingml/2006/wordprocessingDrawing">
   <w:body>
-    <w:bookmarkStart w:id="150" w:name="customer-user-manual"/>
+    <w:bookmarkStart w:id="171" w:name="customer-user-manual"/>
     <w:p>
       <w:pPr>
         <w:pStyle w:val="Heading1"/>
@@ -72,7 +72,7 @@
         <w:pStyle w:val="BodyText"/>
       </w:pPr>
       <w:r>
-        <w:t xml:space="preserve">Manual Type: User Manual for the Customer Role (web application and Android mobile application) · Version 1.2</w:t>
+        <w:t xml:space="preserve">Manual Type: User Manual for the Customer Role (web application and Android mobile application) · Version 1.3</w:t>
       </w:r>
     </w:p>
     <w:bookmarkStart w:id="9" w:name="version-control"/>
@@ -347,6 +347,52 @@
           </w:p>
         </w:tc>
       </w:tr>
+      <w:tr>
+        <w:tc>
+          <w:tcPr/>
+          <w:p>
+            <w:pPr>
+              <w:pStyle w:val="Compact"/>
+            </w:pPr>
+            <w:r>
+              <w:t xml:space="preserve">1.3</w:t>
+            </w:r>
+          </w:p>
+        </w:tc>
+        <w:tc>
+          <w:tcPr/>
+          <w:p>
+            <w:pPr>
+              <w:pStyle w:val="Compact"/>
+            </w:pPr>
+            <w:r>
+              <w:t xml:space="preserve">2026-10-27</w:t>
+            </w:r>
+          </w:p>
+        </w:tc>
+        <w:tc>
+          <w:tcPr/>
+          <w:p>
+            <w:pPr>
+              <w:pStyle w:val="Compact"/>
+            </w:pPr>
+            <w:r>
+              <w:t xml:space="preserve">Mobile application screenshots (Figures 26 to 32) in section 10.11; logging out becomes Figure 33.</w:t>
+            </w:r>
+          </w:p>
+        </w:tc>
+        <w:tc>
+          <w:tcPr/>
+          <w:p>
+            <w:pPr>
+              <w:pStyle w:val="Compact"/>
+            </w:pPr>
+            <w:r>
+              <w:t xml:space="preserve">Development team</w:t>
+            </w:r>
+          </w:p>
+        </w:tc>
+      </w:tr>
     </w:tbl>
     <w:p>
       <w:pPr>
@@ -1510,7 +1556,7 @@
         <w:pStyle w:val="FirstParagraph"/>
       </w:pPr>
       <w:r>
-        <w:t xml:space="preserve">The figures in this manual are real screenshots of the system running with test accounts and data, ordered according to the flow of use. The booking, payment, and history screens (Figures 13 to 15 and 18 to 21) were taken again on October 26, 2026 to show payment at booking and Figure 16 on October 27; the others are from October 19, 2026 and have not changed since then. Their source is explained in Annex A.</w:t>
+        <w:t xml:space="preserve">The figures in this manual are real screenshots of the system running with test accounts and data, ordered according to the flow of use. The booking, payment, and history screens (Figures 13 to 15 and 18 to 21) were taken again on October 26, 2026 to show payment at booking and Figure 16 on October 27; the others are from October 19, 2026 and have not changed since then. Figures 26 to 32 are from the mobile application. Their source is explained in Annex A.</w:t>
       </w:r>
     </w:p>
     <w:bookmarkEnd w:id="19"/>
@@ -4745,7 +4791,7 @@
       </w:r>
     </w:p>
     <w:bookmarkEnd w:id="55"/>
-    <w:bookmarkStart w:id="115" w:name="Xf40aa9a0f052b86485ae7d85ee52ac1da0881c6"/>
+    <w:bookmarkStart w:id="136" w:name="Xf40aa9a0f052b86485ae7d85ee52ac1da0881c6"/>
     <w:p>
       <w:pPr>
         <w:pStyle w:val="Heading2"/>
@@ -11616,7 +11662,7 @@
       </w:r>
     </w:p>
     <w:bookmarkEnd w:id="113"/>
-    <w:bookmarkStart w:id="114" w:name="X7305edbcdc36a63388ae9ea30bdbcf441f9a3cc"/>
+    <w:bookmarkStart w:id="135" w:name="X7305edbcdc36a63388ae9ea30bdbcf441f9a3cc"/>
     <w:p>
       <w:pPr>
         <w:pStyle w:val="Heading3"/>
@@ -12312,6 +12358,584 @@
           <w:b/>
           <w:bCs/>
         </w:rPr>
+        <w:t xml:space="preserve">Figure 26</w:t>
+      </w:r>
+    </w:p>
+    <w:p>
+      <w:pPr>
+        <w:pStyle w:val="BodyText"/>
+      </w:pPr>
+      <w:r>
+        <w:rPr>
+          <w:i/>
+          <w:iCs/>
+        </w:rPr>
+        <w:t xml:space="preserve">Mobile App Sign-In</w:t>
+      </w:r>
+    </w:p>
+    <w:p>
+      <w:pPr>
+        <w:pStyle w:val="BodyText"/>
+      </w:pPr>
+      <w:r>
+        <w:drawing>
+          <wp:inline>
+            <wp:extent cx="5334000" cy="11557904"/>
+            <wp:effectExtent b="0" l="0" r="0" t="0"/>
+            <wp:docPr descr="Mobile App Sign-In" title="" id="115" name="Picture"/>
+            <a:graphic>
+              <a:graphicData uri="http://schemas.openxmlformats.org/drawingml/2006/picture">
+                <pic:pic>
+                  <pic:nvPicPr>
+                    <pic:cNvPr descr="capturas/customer-26-mobile-app-sign-in.jpg" id="116" name="Picture"/>
+                    <pic:cNvPicPr>
+                      <a:picLocks noChangeArrowheads="1" noChangeAspect="1"/>
+                    </pic:cNvPicPr>
+                  </pic:nvPicPr>
+                  <pic:blipFill>
+                    <a:blip r:embed="rId114"/>
+                    <a:stretch>
+                      <a:fillRect/>
+                    </a:stretch>
+                  </pic:blipFill>
+                  <pic:spPr bwMode="auto">
+                    <a:xfrm>
+                      <a:off x="0" y="0"/>
+                      <a:ext cx="5334000" cy="11557904"/>
+                    </a:xfrm>
+                    <a:prstGeom prst="rect">
+                      <a:avLst/>
+                    </a:prstGeom>
+                    <a:noFill/>
+                    <a:ln w="9525">
+                      <a:noFill/>
+                      <a:headEnd/>
+                      <a:tailEnd/>
+                    </a:ln>
+                  </pic:spPr>
+                </pic:pic>
+              </a:graphicData>
+            </a:graphic>
+          </wp:inline>
+        </w:drawing>
+      </w:r>
+    </w:p>
+    <w:p>
+      <w:pPr>
+        <w:pStyle w:val="BodyText"/>
+      </w:pPr>
+      <w:r>
+        <w:rPr>
+          <w:b/>
+          <w:bCs/>
+        </w:rPr>
+        <w:t xml:space="preserve">Figure 27</w:t>
+      </w:r>
+    </w:p>
+    <w:p>
+      <w:pPr>
+        <w:pStyle w:val="BodyText"/>
+      </w:pPr>
+      <w:r>
+        <w:rPr>
+          <w:i/>
+          <w:iCs/>
+        </w:rPr>
+        <w:t xml:space="preserve">Customer Home in the Mobile App</w:t>
+      </w:r>
+    </w:p>
+    <w:p>
+      <w:pPr>
+        <w:pStyle w:val="BodyText"/>
+      </w:pPr>
+      <w:r>
+        <w:drawing>
+          <wp:inline>
+            <wp:extent cx="5334000" cy="11557904"/>
+            <wp:effectExtent b="0" l="0" r="0" t="0"/>
+            <wp:docPr descr="Customer Home in the Mobile App" title="" id="118" name="Picture"/>
+            <a:graphic>
+              <a:graphicData uri="http://schemas.openxmlformats.org/drawingml/2006/picture">
+                <pic:pic>
+                  <pic:nvPicPr>
+                    <pic:cNvPr descr="capturas/customer-27-mobile-app-home.jpg" id="119" name="Picture"/>
+                    <pic:cNvPicPr>
+                      <a:picLocks noChangeArrowheads="1" noChangeAspect="1"/>
+                    </pic:cNvPicPr>
+                  </pic:nvPicPr>
+                  <pic:blipFill>
+                    <a:blip r:embed="rId117"/>
+                    <a:stretch>
+                      <a:fillRect/>
+                    </a:stretch>
+                  </pic:blipFill>
+                  <pic:spPr bwMode="auto">
+                    <a:xfrm>
+                      <a:off x="0" y="0"/>
+                      <a:ext cx="5334000" cy="11557904"/>
+                    </a:xfrm>
+                    <a:prstGeom prst="rect">
+                      <a:avLst/>
+                    </a:prstGeom>
+                    <a:noFill/>
+                    <a:ln w="9525">
+                      <a:noFill/>
+                      <a:headEnd/>
+                      <a:tailEnd/>
+                    </a:ln>
+                  </pic:spPr>
+                </pic:pic>
+              </a:graphicData>
+            </a:graphic>
+          </wp:inline>
+        </w:drawing>
+      </w:r>
+    </w:p>
+    <w:p>
+      <w:pPr>
+        <w:pStyle w:val="BodyText"/>
+      </w:pPr>
+      <w:r>
+        <w:rPr>
+          <w:b/>
+          <w:bCs/>
+        </w:rPr>
+        <w:t xml:space="preserve">Figure 28</w:t>
+      </w:r>
+    </w:p>
+    <w:p>
+      <w:pPr>
+        <w:pStyle w:val="BodyText"/>
+      </w:pPr>
+      <w:r>
+        <w:rPr>
+          <w:i/>
+          <w:iCs/>
+        </w:rPr>
+        <w:t xml:space="preserve">Booking in the Mobile App: Vehicle and Service</w:t>
+      </w:r>
+    </w:p>
+    <w:p>
+      <w:pPr>
+        <w:pStyle w:val="BodyText"/>
+      </w:pPr>
+      <w:r>
+        <w:drawing>
+          <wp:inline>
+            <wp:extent cx="5334000" cy="11557904"/>
+            <wp:effectExtent b="0" l="0" r="0" t="0"/>
+            <wp:docPr descr="Booking in the Mobile App: Vehicle and Service" title="" id="121" name="Picture"/>
+            <a:graphic>
+              <a:graphicData uri="http://schemas.openxmlformats.org/drawingml/2006/picture">
+                <pic:pic>
+                  <pic:nvPicPr>
+                    <pic:cNvPr descr="capturas/customer-28-mobile-app-book-vehicle-and-service.jpg" id="122" name="Picture"/>
+                    <pic:cNvPicPr>
+                      <a:picLocks noChangeArrowheads="1" noChangeAspect="1"/>
+                    </pic:cNvPicPr>
+                  </pic:nvPicPr>
+                  <pic:blipFill>
+                    <a:blip r:embed="rId120"/>
+                    <a:stretch>
+                      <a:fillRect/>
+                    </a:stretch>
+                  </pic:blipFill>
+                  <pic:spPr bwMode="auto">
+                    <a:xfrm>
+                      <a:off x="0" y="0"/>
+                      <a:ext cx="5334000" cy="11557904"/>
+                    </a:xfrm>
+                    <a:prstGeom prst="rect">
+                      <a:avLst/>
+                    </a:prstGeom>
+                    <a:noFill/>
+                    <a:ln w="9525">
+                      <a:noFill/>
+                      <a:headEnd/>
+                      <a:tailEnd/>
+                    </a:ln>
+                  </pic:spPr>
+                </pic:pic>
+              </a:graphicData>
+            </a:graphic>
+          </wp:inline>
+        </w:drawing>
+      </w:r>
+    </w:p>
+    <w:p>
+      <w:pPr>
+        <w:pStyle w:val="BodyText"/>
+      </w:pPr>
+      <w:r>
+        <w:rPr>
+          <w:b/>
+          <w:bCs/>
+        </w:rPr>
+        <w:t xml:space="preserve">Figure 29</w:t>
+      </w:r>
+    </w:p>
+    <w:p>
+      <w:pPr>
+        <w:pStyle w:val="BodyText"/>
+      </w:pPr>
+      <w:r>
+        <w:rPr>
+          <w:i/>
+          <w:iCs/>
+        </w:rPr>
+        <w:t xml:space="preserve">Booking in the Mobile App: Payment Option and Summary</w:t>
+      </w:r>
+    </w:p>
+    <w:p>
+      <w:pPr>
+        <w:pStyle w:val="BodyText"/>
+      </w:pPr>
+      <w:r>
+        <w:drawing>
+          <wp:inline>
+            <wp:extent cx="5334000" cy="11557904"/>
+            <wp:effectExtent b="0" l="0" r="0" t="0"/>
+            <wp:docPr descr="Booking in the Mobile App: Payment Option and Summary" title="" id="124" name="Picture"/>
+            <a:graphic>
+              <a:graphicData uri="http://schemas.openxmlformats.org/drawingml/2006/picture">
+                <pic:pic>
+                  <pic:nvPicPr>
+                    <pic:cNvPr descr="capturas/customer-29-mobile-app-book-time-and-payment-option.jpg" id="125" name="Picture"/>
+                    <pic:cNvPicPr>
+                      <a:picLocks noChangeArrowheads="1" noChangeAspect="1"/>
+                    </pic:cNvPicPr>
+                  </pic:nvPicPr>
+                  <pic:blipFill>
+                    <a:blip r:embed="rId123"/>
+                    <a:stretch>
+                      <a:fillRect/>
+                    </a:stretch>
+                  </pic:blipFill>
+                  <pic:spPr bwMode="auto">
+                    <a:xfrm>
+                      <a:off x="0" y="0"/>
+                      <a:ext cx="5334000" cy="11557904"/>
+                    </a:xfrm>
+                    <a:prstGeom prst="rect">
+                      <a:avLst/>
+                    </a:prstGeom>
+                    <a:noFill/>
+                    <a:ln w="9525">
+                      <a:noFill/>
+                      <a:headEnd/>
+                      <a:tailEnd/>
+                    </a:ln>
+                  </pic:spPr>
+                </pic:pic>
+              </a:graphicData>
+            </a:graphic>
+          </wp:inline>
+        </w:drawing>
+      </w:r>
+    </w:p>
+    <w:p>
+      <w:pPr>
+        <w:pStyle w:val="BodyText"/>
+      </w:pPr>
+      <w:r>
+        <w:rPr>
+          <w:i/>
+          <w:iCs/>
+        </w:rPr>
+        <w:t xml:space="preserve">Note.</w:t>
+      </w:r>
+      <w:r>
+        <w:t xml:space="preserve"> </w:t>
+      </w:r>
+      <w:r>
+        <w:t xml:space="preserve">Screen scrolled to step 4, with</w:t>
+      </w:r>
+      <w:r>
+        <w:t xml:space="preserve"> </w:t>
+      </w:r>
+      <w:r>
+        <w:rPr>
+          <w:b/>
+          <w:bCs/>
+        </w:rPr>
+        <w:t xml:space="preserve">Digital payment now</w:t>
+      </w:r>
+      <w:r>
+        <w:t xml:space="preserve"> </w:t>
+      </w:r>
+      <w:r>
+        <w:t xml:space="preserve">chosen.</w:t>
+      </w:r>
+    </w:p>
+    <w:p>
+      <w:pPr>
+        <w:pStyle w:val="BodyText"/>
+      </w:pPr>
+      <w:r>
+        <w:rPr>
+          <w:b/>
+          <w:bCs/>
+        </w:rPr>
+        <w:t xml:space="preserve">Figure 30</w:t>
+      </w:r>
+    </w:p>
+    <w:p>
+      <w:pPr>
+        <w:pStyle w:val="BodyText"/>
+      </w:pPr>
+      <w:r>
+        <w:rPr>
+          <w:i/>
+          <w:iCs/>
+        </w:rPr>
+        <w:t xml:space="preserve">Payment With the Deadline in the Mobile App</w:t>
+      </w:r>
+    </w:p>
+    <w:p>
+      <w:pPr>
+        <w:pStyle w:val="BodyText"/>
+      </w:pPr>
+      <w:r>
+        <w:drawing>
+          <wp:inline>
+            <wp:extent cx="5334000" cy="11557904"/>
+            <wp:effectExtent b="0" l="0" r="0" t="0"/>
+            <wp:docPr descr="Payment With the Deadline in the Mobile App" title="" id="127" name="Picture"/>
+            <a:graphic>
+              <a:graphicData uri="http://schemas.openxmlformats.org/drawingml/2006/picture">
+                <pic:pic>
+                  <pic:nvPicPr>
+                    <pic:cNvPr descr="capturas/customer-30-mobile-app-pay-service-with-deadline.jpg" id="128" name="Picture"/>
+                    <pic:cNvPicPr>
+                      <a:picLocks noChangeArrowheads="1" noChangeAspect="1"/>
+                    </pic:cNvPicPr>
+                  </pic:nvPicPr>
+                  <pic:blipFill>
+                    <a:blip r:embed="rId126"/>
+                    <a:stretch>
+                      <a:fillRect/>
+                    </a:stretch>
+                  </pic:blipFill>
+                  <pic:spPr bwMode="auto">
+                    <a:xfrm>
+                      <a:off x="0" y="0"/>
+                      <a:ext cx="5334000" cy="11557904"/>
+                    </a:xfrm>
+                    <a:prstGeom prst="rect">
+                      <a:avLst/>
+                    </a:prstGeom>
+                    <a:noFill/>
+                    <a:ln w="9525">
+                      <a:noFill/>
+                      <a:headEnd/>
+                      <a:tailEnd/>
+                    </a:ln>
+                  </pic:spPr>
+                </pic:pic>
+              </a:graphicData>
+            </a:graphic>
+          </wp:inline>
+        </w:drawing>
+      </w:r>
+    </w:p>
+    <w:p>
+      <w:pPr>
+        <w:pStyle w:val="BodyText"/>
+      </w:pPr>
+      <w:r>
+        <w:rPr>
+          <w:i/>
+          <w:iCs/>
+        </w:rPr>
+        <w:t xml:space="preserve">Note.</w:t>
+      </w:r>
+      <w:r>
+        <w:t xml:space="preserve"> </w:t>
+      </w:r>
+      <w:r>
+        <w:t xml:space="preserve">It opens on its own after</w:t>
+      </w:r>
+      <w:r>
+        <w:t xml:space="preserve"> </w:t>
+      </w:r>
+      <w:r>
+        <w:rPr>
+          <w:b/>
+          <w:bCs/>
+        </w:rPr>
+        <w:t xml:space="preserve">Book Now</w:t>
+      </w:r>
+      <w:r>
+        <w:t xml:space="preserve"> </w:t>
+      </w:r>
+      <w:r>
+        <w:t xml:space="preserve">with digital payment; in the app the screen is titled</w:t>
+      </w:r>
+      <w:r>
+        <w:t xml:space="preserve"> </w:t>
+      </w:r>
+      <w:r>
+        <w:rPr>
+          <w:b/>
+          <w:bCs/>
+        </w:rPr>
+        <w:t xml:space="preserve">Payment Gateway</w:t>
+      </w:r>
+      <w:r>
+        <w:t xml:space="preserve">.</w:t>
+      </w:r>
+    </w:p>
+    <w:p>
+      <w:pPr>
+        <w:pStyle w:val="BodyText"/>
+      </w:pPr>
+      <w:r>
+        <w:rPr>
+          <w:b/>
+          <w:bCs/>
+        </w:rPr>
+        <w:t xml:space="preserve">Figure 31</w:t>
+      </w:r>
+    </w:p>
+    <w:p>
+      <w:pPr>
+        <w:pStyle w:val="BodyText"/>
+      </w:pPr>
+      <w:r>
+        <w:rPr>
+          <w:i/>
+          <w:iCs/>
+        </w:rPr>
+        <w:t xml:space="preserve">History in the Mobile App</w:t>
+      </w:r>
+    </w:p>
+    <w:p>
+      <w:pPr>
+        <w:pStyle w:val="BodyText"/>
+      </w:pPr>
+      <w:r>
+        <w:drawing>
+          <wp:inline>
+            <wp:extent cx="5334000" cy="11557904"/>
+            <wp:effectExtent b="0" l="0" r="0" t="0"/>
+            <wp:docPr descr="History in the Mobile App" title="" id="130" name="Picture"/>
+            <a:graphic>
+              <a:graphicData uri="http://schemas.openxmlformats.org/drawingml/2006/picture">
+                <pic:pic>
+                  <pic:nvPicPr>
+                    <pic:cNvPr descr="capturas/customer-31-mobile-app-history.jpg" id="131" name="Picture"/>
+                    <pic:cNvPicPr>
+                      <a:picLocks noChangeArrowheads="1" noChangeAspect="1"/>
+                    </pic:cNvPicPr>
+                  </pic:nvPicPr>
+                  <pic:blipFill>
+                    <a:blip r:embed="rId129"/>
+                    <a:stretch>
+                      <a:fillRect/>
+                    </a:stretch>
+                  </pic:blipFill>
+                  <pic:spPr bwMode="auto">
+                    <a:xfrm>
+                      <a:off x="0" y="0"/>
+                      <a:ext cx="5334000" cy="11557904"/>
+                    </a:xfrm>
+                    <a:prstGeom prst="rect">
+                      <a:avLst/>
+                    </a:prstGeom>
+                    <a:noFill/>
+                    <a:ln w="9525">
+                      <a:noFill/>
+                      <a:headEnd/>
+                      <a:tailEnd/>
+                    </a:ln>
+                  </pic:spPr>
+                </pic:pic>
+              </a:graphicData>
+            </a:graphic>
+          </wp:inline>
+        </w:drawing>
+      </w:r>
+    </w:p>
+    <w:p>
+      <w:pPr>
+        <w:pStyle w:val="BodyText"/>
+      </w:pPr>
+      <w:r>
+        <w:rPr>
+          <w:b/>
+          <w:bCs/>
+        </w:rPr>
+        <w:t xml:space="preserve">Figure 32</w:t>
+      </w:r>
+    </w:p>
+    <w:p>
+      <w:pPr>
+        <w:pStyle w:val="BodyText"/>
+      </w:pPr>
+      <w:r>
+        <w:rPr>
+          <w:i/>
+          <w:iCs/>
+        </w:rPr>
+        <w:t xml:space="preserve">Customer More Menu in the Mobile App</w:t>
+      </w:r>
+    </w:p>
+    <w:p>
+      <w:pPr>
+        <w:pStyle w:val="BodyText"/>
+      </w:pPr>
+      <w:r>
+        <w:drawing>
+          <wp:inline>
+            <wp:extent cx="5334000" cy="11557904"/>
+            <wp:effectExtent b="0" l="0" r="0" t="0"/>
+            <wp:docPr descr="Customer More Menu in the Mobile App" title="" id="133" name="Picture"/>
+            <a:graphic>
+              <a:graphicData uri="http://schemas.openxmlformats.org/drawingml/2006/picture">
+                <pic:pic>
+                  <pic:nvPicPr>
+                    <pic:cNvPr descr="capturas/customer-32-mobile-app-more-menu.jpg" id="134" name="Picture"/>
+                    <pic:cNvPicPr>
+                      <a:picLocks noChangeArrowheads="1" noChangeAspect="1"/>
+                    </pic:cNvPicPr>
+                  </pic:nvPicPr>
+                  <pic:blipFill>
+                    <a:blip r:embed="rId132"/>
+                    <a:stretch>
+                      <a:fillRect/>
+                    </a:stretch>
+                  </pic:blipFill>
+                  <pic:spPr bwMode="auto">
+                    <a:xfrm>
+                      <a:off x="0" y="0"/>
+                      <a:ext cx="5334000" cy="11557904"/>
+                    </a:xfrm>
+                    <a:prstGeom prst="rect">
+                      <a:avLst/>
+                    </a:prstGeom>
+                    <a:noFill/>
+                    <a:ln w="9525">
+                      <a:noFill/>
+                      <a:headEnd/>
+                      <a:tailEnd/>
+                    </a:ln>
+                  </pic:spPr>
+                </pic:pic>
+              </a:graphicData>
+            </a:graphic>
+          </wp:inline>
+        </w:drawing>
+      </w:r>
+    </w:p>
+    <w:p>
+      <w:pPr>
+        <w:pStyle w:val="BodyText"/>
+      </w:pPr>
+      <w:r>
+        <w:rPr>
+          <w:b/>
+          <w:bCs/>
+        </w:rPr>
         <w:t xml:space="preserve">Push notifications.</w:t>
       </w:r>
       <w:r>
@@ -12459,9 +13083,9 @@
         <w:t xml:space="preserve">.</w:t>
       </w:r>
     </w:p>
-    <w:bookmarkEnd w:id="114"/>
-    <w:bookmarkEnd w:id="115"/>
-    <w:bookmarkStart w:id="116" w:name="X4f34fcd2baa3c6c2113ad2dab038370b4f193c3"/>
+    <w:bookmarkEnd w:id="135"/>
+    <w:bookmarkEnd w:id="136"/>
+    <w:bookmarkStart w:id="137" w:name="X4f34fcd2baa3c6c2113ad2dab038370b4f193c3"/>
     <w:p>
       <w:pPr>
         <w:pStyle w:val="Heading2"/>
@@ -14616,8 +15240,8 @@
         <w:t xml:space="preserve">Texts taken from the English translation file of the web application.</w:t>
       </w:r>
     </w:p>
-    <w:bookmarkEnd w:id="116"/>
-    <w:bookmarkStart w:id="120" w:name="X4c17fc38dd633d427028e770c213bfe3965e315"/>
+    <w:bookmarkEnd w:id="137"/>
+    <w:bookmarkStart w:id="141" w:name="X4c17fc38dd633d427028e770c213bfe3965e315"/>
     <w:p>
       <w:pPr>
         <w:pStyle w:val="Heading2"/>
@@ -14757,7 +15381,7 @@
           <w:b/>
           <w:bCs/>
         </w:rPr>
-        <w:t xml:space="preserve">Figure 26</w:t>
+        <w:t xml:space="preserve">Figure 33</w:t>
       </w:r>
     </w:p>
     <w:p>
@@ -14781,18 +15405,18 @@
           <wp:inline>
             <wp:extent cx="5334000" cy="3201961"/>
             <wp:effectExtent b="0" l="0" r="0" t="0"/>
-            <wp:docPr descr="Log Out Confirmation" title="" id="118" name="Picture"/>
+            <wp:docPr descr="Log Out Confirmation" title="" id="139" name="Picture"/>
             <a:graphic>
               <a:graphicData uri="http://schemas.openxmlformats.org/drawingml/2006/picture">
                 <pic:pic>
                   <pic:nvPicPr>
-                    <pic:cNvPr descr="capturas/customer-25-log-out-confirmation.jpg" id="119" name="Picture"/>
+                    <pic:cNvPr descr="capturas/customer-25-log-out-confirmation.jpg" id="140" name="Picture"/>
                     <pic:cNvPicPr>
                       <a:picLocks noChangeArrowheads="1" noChangeAspect="1"/>
                     </pic:cNvPicPr>
                   </pic:nvPicPr>
                   <pic:blipFill>
-                    <a:blip r:embed="rId117"/>
+                    <a:blip r:embed="rId138"/>
                     <a:stretch>
                       <a:fillRect/>
                     </a:stretch>
@@ -14819,8 +15443,8 @@
         </w:drawing>
       </w:r>
     </w:p>
-    <w:bookmarkEnd w:id="120"/>
-    <w:bookmarkStart w:id="140" w:name="X7a4913db6cb1b3c4cb6c122beacaf68da4b3196"/>
+    <w:bookmarkEnd w:id="141"/>
+    <w:bookmarkStart w:id="161" w:name="X7a4913db6cb1b3c4cb6c122beacaf68da4b3196"/>
     <w:p>
       <w:pPr>
         <w:pStyle w:val="Heading2"/>
@@ -14829,7 +15453,7 @@
         <w:t xml:space="preserve">13. Frequently Asked Questions</w:t>
       </w:r>
     </w:p>
-    <w:bookmarkStart w:id="121" w:name="what-do-i-do-if-i-forgot-my-password"/>
+    <w:bookmarkStart w:id="142" w:name="what-do-i-do-if-i-forgot-my-password"/>
     <w:p>
       <w:pPr>
         <w:pStyle w:val="Heading5"/>
@@ -14846,8 +15470,8 @@
         <w:t xml:space="preserve">On the login screen, click "Forgot your password?" and follow the three steps of section 8.3. The code arrives at the registered email and is valid for 15 minutes.</w:t>
       </w:r>
     </w:p>
-    <w:bookmarkEnd w:id="121"/>
-    <w:bookmarkStart w:id="122" w:name="why-wont-the-system-let-me-register"/>
+    <w:bookmarkEnd w:id="142"/>
+    <w:bookmarkStart w:id="143" w:name="why-wont-the-system-let-me-register"/>
     <w:p>
       <w:pPr>
         <w:pStyle w:val="Heading5"/>
@@ -14864,8 +15488,8 @@
         <w:t xml:space="preserve">Sign-up only accepts emails ending in @gmail.com, and each email and each ID number can have only one account. In addition, the two legal documents must be accepted.</w:t>
       </w:r>
     </w:p>
-    <w:bookmarkEnd w:id="122"/>
-    <w:bookmarkStart w:id="123" w:name="Xb140809e2abbb109ad0f9bed9537768fa1908a3"/>
+    <w:bookmarkEnd w:id="143"/>
+    <w:bookmarkStart w:id="144" w:name="Xb140809e2abbb109ad0f9bed9537768fa1908a3"/>
     <w:p>
       <w:pPr>
         <w:pStyle w:val="Heading5"/>
@@ -14898,8 +15522,8 @@
         <w:t xml:space="preserve">to create a new password and log in right away.</w:t>
       </w:r>
     </w:p>
-    <w:bookmarkEnd w:id="123"/>
-    <w:bookmarkStart w:id="124" w:name="X2742a6725edfa4dceba04bb2a78a624c9034984"/>
+    <w:bookmarkEnd w:id="144"/>
+    <w:bookmarkStart w:id="145" w:name="X2742a6725edfa4dceba04bb2a78a624c9034984"/>
     <w:p>
       <w:pPr>
         <w:pStyle w:val="Heading5"/>
@@ -14916,8 +15540,8 @@
         <w:t xml:space="preserve">When the time is free, the booking is confirmed at once: it appears in the dashboard and in History with the status Confirmed and the confirmation arrives by email. With digital payment, the system takes you to the payment screen; with cash, it shows "Booking created!".</w:t>
       </w:r>
     </w:p>
-    <w:bookmarkEnd w:id="124"/>
-    <w:bookmarkStart w:id="125" w:name="Xdb403392929fba726b4bab996b3409b4d12de55"/>
+    <w:bookmarkEnd w:id="145"/>
+    <w:bookmarkStart w:id="146" w:name="Xdb403392929fba726b4bab996b3409b4d12de55"/>
     <w:p>
       <w:pPr>
         <w:pStyle w:val="Heading5"/>
@@ -14934,8 +15558,8 @@
         <w:t xml:space="preserve">The screen only offers free times. If another person takes the time while you book, the system suggests the closest free times of the same day that your vehicle can take (not those that overlap another booking of yours); choose one and confirm.</w:t>
       </w:r>
     </w:p>
-    <w:bookmarkEnd w:id="125"/>
-    <w:bookmarkStart w:id="126" w:name="can-i-choose-who-washes-my-vehicle"/>
+    <w:bookmarkEnd w:id="146"/>
+    <w:bookmarkStart w:id="147" w:name="can-i-choose-who-washes-my-vehicle"/>
     <w:p>
       <w:pPr>
         <w:pStyle w:val="Heading5"/>
@@ -14968,8 +15592,8 @@
         <w:t xml:space="preserve">lists the operators who are free at that time. If you do not choose one, the system assigns a free operator automatically. You can see the assigned operator in the dashboard and receive a notification when the operator is assigned or changed.</w:t>
       </w:r>
     </w:p>
-    <w:bookmarkEnd w:id="126"/>
-    <w:bookmarkStart w:id="127" w:name="how-do-i-change-the-date-of-a-booking"/>
+    <w:bookmarkEnd w:id="147"/>
+    <w:bookmarkStart w:id="148" w:name="how-do-i-change-the-date-of-a-booking"/>
     <w:p>
       <w:pPr>
         <w:pStyle w:val="Heading5"/>
@@ -14986,8 +15610,8 @@
         <w:t xml:space="preserve">The system does not let the customer change the date or the time. Cancel the booking before its start time and book again, or contact the business so that the administrator reschedules it.</w:t>
       </w:r>
     </w:p>
-    <w:bookmarkEnd w:id="127"/>
-    <w:bookmarkStart w:id="128" w:name="Xd46a745d1d7bc5f1116a20cd4d2ea4d66c5912f"/>
+    <w:bookmarkEnd w:id="148"/>
+    <w:bookmarkStart w:id="149" w:name="Xd46a745d1d7bc5f1116a20cd4d2ea4d66c5912f"/>
     <w:p>
       <w:pPr>
         <w:pStyle w:val="Heading5"/>
@@ -15004,8 +15628,8 @@
         <w:t xml:space="preserve">The business records the booking as No show. If the booking had no operator assigned, the system marks it this way one hour after the end time. If you had already paid, contact the business: the administrator decides on the refund.</w:t>
       </w:r>
     </w:p>
-    <w:bookmarkEnd w:id="128"/>
-    <w:bookmarkStart w:id="129" w:name="how-do-i-pay-for-my-service"/>
+    <w:bookmarkEnd w:id="149"/>
+    <w:bookmarkStart w:id="150" w:name="how-do-i-pay-for-my-service"/>
     <w:p>
       <w:pPr>
         <w:pStyle w:val="Heading5"/>
@@ -15067,8 +15691,8 @@
         <w:t xml:space="preserve">(if the business has it active), pay on arrival.</w:t>
       </w:r>
     </w:p>
-    <w:bookmarkEnd w:id="129"/>
-    <w:bookmarkStart w:id="130" w:name="why-was-my-booking-cancelled-on-its-own"/>
+    <w:bookmarkEnd w:id="150"/>
+    <w:bookmarkStart w:id="151" w:name="why-was-my-booking-cancelled-on-its-own"/>
     <w:p>
       <w:pPr>
         <w:pStyle w:val="Heading5"/>
@@ -15117,8 +15741,8 @@
         <w:t xml:space="preserve">if you have no other active cash booking.</w:t>
       </w:r>
     </w:p>
-    <w:bookmarkEnd w:id="130"/>
-    <w:bookmarkStart w:id="131" w:name="why-dont-i-see-the-cash-option"/>
+    <w:bookmarkEnd w:id="151"/>
+    <w:bookmarkStart w:id="152" w:name="why-dont-i-see-the-cash-option"/>
     <w:p>
       <w:pPr>
         <w:pStyle w:val="Heading5"/>
@@ -15135,8 +15759,8 @@
         <w:t xml:space="preserve">Because the business does not have the cash account active or because you already have an active cash booking: only one is allowed at a time.</w:t>
       </w:r>
     </w:p>
-    <w:bookmarkEnd w:id="131"/>
-    <w:bookmarkStart w:id="132" w:name="does-the-system-store-my-card-data"/>
+    <w:bookmarkEnd w:id="152"/>
+    <w:bookmarkStart w:id="153" w:name="does-the-system-store-my-card-data"/>
     <w:p>
       <w:pPr>
         <w:pStyle w:val="Heading5"/>
@@ -15153,8 +15777,8 @@
         <w:t xml:space="preserve">No. The system does not request or store card data.</w:t>
       </w:r>
     </w:p>
-    <w:bookmarkEnd w:id="132"/>
-    <w:bookmarkStart w:id="133" w:name="why-does-my-payment-appear-as-in-review"/>
+    <w:bookmarkEnd w:id="153"/>
+    <w:bookmarkStart w:id="154" w:name="why-does-my-payment-appear-as-in-review"/>
     <w:p>
       <w:pPr>
         <w:pStyle w:val="Heading5"/>
@@ -15171,8 +15795,8 @@
         <w:t xml:space="preserve">Because an administrator must verify that the money arrived in the business's account. When the administrator approves or rejects it, you receive a notification and an email; you can also check the status in History.</w:t>
       </w:r>
     </w:p>
-    <w:bookmarkEnd w:id="133"/>
-    <w:bookmarkStart w:id="134" w:name="can-i-use-a-promotion-code"/>
+    <w:bookmarkEnd w:id="154"/>
+    <w:bookmarkStart w:id="155" w:name="can-i-use-a-promotion-code"/>
     <w:p>
       <w:pPr>
         <w:pStyle w:val="Heading5"/>
@@ -15189,8 +15813,8 @@
         <w:t xml:space="preserve">Yes. When your points unlock a coupon, you receive a notice with its code. In Pay service, type it in Coupon code and click Apply before confirming the payment. Only one coupon is accepted per booking.</w:t>
       </w:r>
     </w:p>
-    <w:bookmarkEnd w:id="134"/>
-    <w:bookmarkStart w:id="135" w:name="how-do-i-earn-loyalty-points"/>
+    <w:bookmarkEnd w:id="155"/>
+    <w:bookmarkStart w:id="156" w:name="how-do-i-earn-loyalty-points"/>
     <w:p>
       <w:pPr>
         <w:pStyle w:val="Heading5"/>
@@ -15207,8 +15831,8 @@
         <w:t xml:space="preserve">Each service adds the points shown when booking ("Earns N points"). The points are credited when the administrator approves the payment of the booking, and you can see your progress in the dashboard. Points are not spent: they unlock coupons.</w:t>
       </w:r>
     </w:p>
-    <w:bookmarkEnd w:id="135"/>
-    <w:bookmarkStart w:id="136" w:name="how-do-i-rate-a-service"/>
+    <w:bookmarkEnd w:id="156"/>
+    <w:bookmarkStart w:id="157" w:name="how-do-i-rate-a-service"/>
     <w:p>
       <w:pPr>
         <w:pStyle w:val="Heading5"/>
@@ -15225,8 +15849,8 @@
         <w:t xml:space="preserve">When the booking is Completed, open History, click "Rate Service", choose from one to five stars, and, if desired, write a comment. Each booking can be rated only once.</w:t>
       </w:r>
     </w:p>
-    <w:bookmarkEnd w:id="136"/>
-    <w:bookmarkStart w:id="137" w:name="X8cba4d7b3320468f8a35e58483c6fbd0e96b060"/>
+    <w:bookmarkEnd w:id="157"/>
+    <w:bookmarkStart w:id="158" w:name="X8cba4d7b3320468f8a35e58483c6fbd0e96b060"/>
     <w:p>
       <w:pPr>
         <w:pStyle w:val="Heading5"/>
@@ -15243,8 +15867,8 @@
         <w:t xml:space="preserve">It is the inspection report: the business records, by phases and with photos, the condition of your vehicle when receiving it and when delivering it. It opens with the link of the notice, without logging in (section 10.8).</w:t>
       </w:r>
     </w:p>
-    <w:bookmarkEnd w:id="137"/>
-    <w:bookmarkStart w:id="138" w:name="can-i-change-the-language-or-the-colors"/>
+    <w:bookmarkEnd w:id="158"/>
+    <w:bookmarkStart w:id="159" w:name="can-i-change-the-language-or-the-colors"/>
     <w:p>
       <w:pPr>
         <w:pStyle w:val="Heading5"/>
@@ -15261,8 +15885,8 @@
         <w:t xml:space="preserve">Yes. In Settings you can choose Spanish, English, French, or Portuguese and one of four color themes; the choice is saved in your account.</w:t>
       </w:r>
     </w:p>
-    <w:bookmarkEnd w:id="138"/>
-    <w:bookmarkStart w:id="139" w:name="can-i-delete-or-deactivate-my-account"/>
+    <w:bookmarkEnd w:id="159"/>
+    <w:bookmarkStart w:id="160" w:name="can-i-delete-or-deactivate-my-account"/>
     <w:p>
       <w:pPr>
         <w:pStyle w:val="Heading5"/>
@@ -15295,9 +15919,9 @@
         <w:t xml:space="preserve">option deactivates the account, without erasing it: you will not be able to log in, but your history is kept. To reactivate it, contact the administrator.</w:t>
       </w:r>
     </w:p>
-    <w:bookmarkEnd w:id="139"/>
-    <w:bookmarkEnd w:id="140"/>
-    <w:bookmarkStart w:id="141" w:name="X0fa6fbdd5490fe47b49d10c65f8bfca49160d19"/>
+    <w:bookmarkEnd w:id="160"/>
+    <w:bookmarkEnd w:id="161"/>
+    <w:bookmarkStart w:id="162" w:name="X0fa6fbdd5490fe47b49d10c65f8bfca49160d19"/>
     <w:p>
       <w:pPr>
         <w:pStyle w:val="Heading2"/>
@@ -15842,8 +16466,8 @@
         <w:t xml:space="preserve">Based on the glossary of the project documentation.</w:t>
       </w:r>
     </w:p>
-    <w:bookmarkEnd w:id="141"/>
-    <w:bookmarkStart w:id="146" w:name="references"/>
+    <w:bookmarkEnd w:id="162"/>
+    <w:bookmarkStart w:id="167" w:name="references"/>
     <w:p>
       <w:pPr>
         <w:pStyle w:val="Heading2"/>
@@ -15878,7 +16502,7 @@
       <w:r>
         <w:t xml:space="preserve"> </w:t>
       </w:r>
-      <w:hyperlink r:id="rId142">
+      <w:hyperlink r:id="rId163">
         <w:r>
           <w:rPr>
             <w:rStyle w:val="Hyperlink"/>
@@ -15937,7 +16561,7 @@
       <w:r>
         <w:t xml:space="preserve"> </w:t>
       </w:r>
-      <w:hyperlink r:id="rId143">
+      <w:hyperlink r:id="rId164">
         <w:r>
           <w:rPr>
             <w:rStyle w:val="Hyperlink"/>
@@ -15972,7 +16596,7 @@
       <w:r>
         <w:t xml:space="preserve"> </w:t>
       </w:r>
-      <w:hyperlink r:id="rId144">
+      <w:hyperlink r:id="rId165">
         <w:r>
           <w:rPr>
             <w:rStyle w:val="Hyperlink"/>
@@ -16007,7 +16631,7 @@
       <w:r>
         <w:t xml:space="preserve"> </w:t>
       </w:r>
-      <w:hyperlink r:id="rId145">
+      <w:hyperlink r:id="rId166">
         <w:r>
           <w:rPr>
             <w:rStyle w:val="Hyperlink"/>
@@ -16016,8 +16640,8 @@
         </w:r>
       </w:hyperlink>
     </w:p>
-    <w:bookmarkEnd w:id="146"/>
-    <w:bookmarkStart w:id="149" w:name="X8cfa2d58357511abd614ba97b7597f227b1ab02"/>
+    <w:bookmarkEnd w:id="167"/>
+    <w:bookmarkStart w:id="170" w:name="X8cfa2d58357511abd614ba97b7597f227b1ab02"/>
     <w:p>
       <w:pPr>
         <w:pStyle w:val="Heading2"/>
@@ -16026,7 +16650,7 @@
         <w:t xml:space="preserve">15. Annexes</w:t>
       </w:r>
     </w:p>
-    <w:bookmarkStart w:id="147" w:name="annex-a-source-of-the-screenshots"/>
+    <w:bookmarkStart w:id="168" w:name="annex-a-source-of-the-screenshots"/>
     <w:p>
       <w:pPr>
         <w:pStyle w:val="Heading3"/>
@@ -16069,16 +16693,26 @@
         <w:t xml:space="preserve"> </w:t>
       </w:r>
       <w:r>
-        <w:t xml:space="preserve">branch, with the interface in English. Figures 13 to 15 and 18 to 21 were taken on October 26, 2026 to show payment at booking, with a test customer account and a test QR code, and Figure 16 on October 27, 2026, with test bookings that filled the bays at that time; the others, on October 19, 2026, and correspond to screens that have not changed since then. Test accounts, vehicles, bookings, and payments created only for the screenshots were used, so no real emails, ID numbers, phone numbers, plates, or bank accounts appear. If a screen changes in a future version, the corresponding screenshot must be taken again with the same file name in the</w:t>
-      </w:r>
-      <w:r>
-        <w:t xml:space="preserve"> </w:t>
+        <w:t xml:space="preserve">branch, with the interface in English. Figures 13 to 15 and 18 to 21 were taken on October 26, 2026 to show payment at booking, with a test customer account and a test QR code, and Figure 16 on October 27, 2026, with test bookings that filled the bays at that time; the others, on October 19, 2026, and correspond to screens that have not changed since then. Test accounts, vehicles, bookings, and payments created only for the screenshots were used, so no real emails, ID numbers, phone numbers, plates, or bank accounts appear. The mobile app screenshots were taken on October 27, 2026 with the app's code (</w:t>
       </w:r>
       <w:r>
         <w:rPr>
           <w:i/>
           <w:iCs/>
         </w:rPr>
+        <w:t xml:space="preserve">develop</w:t>
+      </w:r>
+      <w:r>
+        <w:t xml:space="preserve">, version 1.1.1) running in Expo's web mode, with the screen size and density of a phone (393 × 852 points, density 2.5), against the same local system and with the same test accounts. The screens are the app's; the only difference from the phone is that the status bar and the operating system permissions do not appear. If a screen changes in a future version, the corresponding screenshot must be taken again with the same file name in the</w:t>
+      </w:r>
+      <w:r>
+        <w:t xml:space="preserve"> </w:t>
+      </w:r>
+      <w:r>
+        <w:rPr>
+          <w:i/>
+          <w:iCs/>
+        </w:rPr>
         <w:t xml:space="preserve">capturas</w:t>
       </w:r>
       <w:r>
@@ -16088,8 +16722,8 @@
         <w:t xml:space="preserve">folder.</w:t>
       </w:r>
     </w:p>
-    <w:bookmarkEnd w:id="147"/>
-    <w:bookmarkStart w:id="148" w:name="annex-b-delivery-checklist"/>
+    <w:bookmarkEnd w:id="168"/>
+    <w:bookmarkStart w:id="169" w:name="annex-b-delivery-checklist"/>
     <w:p>
       <w:pPr>
         <w:pStyle w:val="Heading3"/>
@@ -16431,9 +17065,9 @@
         <w:t xml:space="preserve">Adapted from the checklist of the guide for writing software manuals (SENA, 2026).</w:t>
       </w:r>
     </w:p>
-    <w:bookmarkEnd w:id="148"/>
-    <w:bookmarkEnd w:id="149"/>
-    <w:bookmarkEnd w:id="150"/>
+    <w:bookmarkEnd w:id="169"/>
+    <w:bookmarkEnd w:id="170"/>
+    <w:bookmarkEnd w:id="171"/>
     <w:sectPr>
       <w:footnotePr>
         <w:numRestart w:val="eachSect"/>

</xml_diff>

<commit_message>
docs(customer-manual): regenerate the PDF and Word
</commit_message>
<xml_diff>
--- a/09_MANUALES/EN/WORD/09_Customer_User_Manual.docx
+++ b/09_MANUALES/EN/WORD/09_Customer_User_Manual.docx
@@ -64,15 +64,15 @@
         <w:pStyle w:val="BodyText"/>
       </w:pPr>
       <w:r>
-        <w:t xml:space="preserve">October 26, 2026</w:t>
-      </w:r>
-    </w:p>
-    <w:p>
-      <w:pPr>
-        <w:pStyle w:val="BodyText"/>
-      </w:pPr>
-      <w:r>
-        <w:t xml:space="preserve">Manual Type: User Manual for the Customer Role (web application and Android mobile application) · Version 1.3</w:t>
+        <w:t xml:space="preserve">October 27, 2026</w:t>
+      </w:r>
+    </w:p>
+    <w:p>
+      <w:pPr>
+        <w:pStyle w:val="BodyText"/>
+      </w:pPr>
+      <w:r>
+        <w:t xml:space="preserve">Manual Type: User Manual for the Customer Role (web application and Android mobile application) · Version 1.4</w:t>
       </w:r>
     </w:p>
     <w:bookmarkStart w:id="9" w:name="version-control"/>
@@ -378,6 +378,62 @@
             </w:pPr>
             <w:r>
               <w:t xml:space="preserve">Mobile application screenshots (Figures 26 to 32) in section 10.11; logging out becomes Figure 33.</w:t>
+            </w:r>
+          </w:p>
+        </w:tc>
+        <w:tc>
+          <w:tcPr/>
+          <w:p>
+            <w:pPr>
+              <w:pStyle w:val="Compact"/>
+            </w:pPr>
+            <w:r>
+              <w:t xml:space="preserve">Development team</w:t>
+            </w:r>
+          </w:p>
+        </w:tc>
+      </w:tr>
+      <w:tr>
+        <w:tc>
+          <w:tcPr/>
+          <w:p>
+            <w:pPr>
+              <w:pStyle w:val="Compact"/>
+            </w:pPr>
+            <w:r>
+              <w:t xml:space="preserve">1.4</w:t>
+            </w:r>
+          </w:p>
+        </w:tc>
+        <w:tc>
+          <w:tcPr/>
+          <w:p>
+            <w:pPr>
+              <w:pStyle w:val="Compact"/>
+            </w:pPr>
+            <w:r>
+              <w:t xml:space="preserve">2026-10-27</w:t>
+            </w:r>
+          </w:p>
+        </w:tc>
+        <w:tc>
+          <w:tcPr/>
+          <w:p>
+            <w:pPr>
+              <w:pStyle w:val="Compact"/>
+            </w:pPr>
+            <w:r>
+              <w:t xml:space="preserve">Terms and Conditions: section 6 with the 30-minute deadline for digital payment and the limit of one active cash booking (8.1); over-the-air update of the app of October 27 (</w:t>
+            </w:r>
+            <w:r>
+              <w:rPr>
+                <w:i/>
+                <w:iCs/>
+              </w:rPr>
+              <w:t xml:space="preserve">v1.1.2</w:t>
+            </w:r>
+            <w:r>
+              <w:t xml:space="preserve">) (10.11 and references).</w:t>
             </w:r>
           </w:p>
         </w:tc>
@@ -3001,7 +3057,20 @@
         <w:t xml:space="preserve"> </w:t>
       </w:r>
       <w:r>
-        <w:t xml:space="preserve">have 15 sections. Since October 26, 2026 they are written in the third person ("the Customer") and include section 8,</w:t>
+        <w:t xml:space="preserve">have 15 sections. Since October 26, 2026 they are written in the third person ("the Customer"). Section 6,</w:t>
+      </w:r>
+      <w:r>
+        <w:t xml:space="preserve"> </w:t>
+      </w:r>
+      <w:r>
+        <w:rPr>
+          <w:b/>
+          <w:bCs/>
+        </w:rPr>
+        <w:t xml:space="preserve">Bookings, cancellations, and service delivery</w:t>
+      </w:r>
+      <w:r>
+        <w:t xml:space="preserve">, says that with digital payment the receipt must be uploaded within 30 minutes of the booking (or before the service time, if that is sooner), because otherwise the booking is cancelled automatically and the slot is freed, and that with cash payment the customer can have at most one active booking. The terms also include section 8,</w:t>
       </w:r>
       <w:r>
         <w:t xml:space="preserve"> </w:t>
@@ -11708,7 +11777,20 @@
         <w:t xml:space="preserve"> </w:t>
       </w:r>
       <w:r>
-        <w:t xml:space="preserve">6, published on October 26, 2026) offers the customer the same functions as the web, with the same rules and the same data: a booking made in the app appears on the web and vice versa. This section explains how to install it and how its use differs; the rules of each module are those of sections 10.1 to 10.10.</w:t>
+        <w:t xml:space="preserve">6, published on October 26, 2026; on October 27 it received over the internet the corrected note of the booking step, repository</w:t>
+      </w:r>
+      <w:r>
+        <w:t xml:space="preserve"> </w:t>
+      </w:r>
+      <w:r>
+        <w:rPr>
+          <w:i/>
+          <w:iCs/>
+        </w:rPr>
+        <w:t xml:space="preserve">v1.1.2</w:t>
+      </w:r>
+      <w:r>
+        <w:t xml:space="preserve">, without a new APK) offers the customer the same functions as the web, with the same rules and the same data: a booking made in the app appears on the web and vice versa. This section explains how to install it and how its use differs; the rules of each module are those of sections 10.1 to 10.10.</w:t>
       </w:r>
     </w:p>
     <w:p>
@@ -16626,7 +16708,7 @@
         <w:t xml:space="preserve"> </w:t>
       </w:r>
       <w:r>
-        <w:t xml:space="preserve">(version 1.1.0) [Computer software]. GitHub.</w:t>
+        <w:t xml:space="preserve">(version 1.1.2) [Computer software]. GitHub.</w:t>
       </w:r>
       <w:r>
         <w:t xml:space="preserve"> </w:t>

</xml_diff>